<commit_message>
Fix 4 reference title errors found by full 181-ref web-verification audit
di Maggio et al. 2022 (07), Sarkar+Vafa 2024 (08), Slattery & Zidar 2020 (11),
Palmon et al. 1997 (14): corrected LLM-approximated titles / restored a dropped coauthor.
All 4 real papers; verified against NBER/SSRN/AEA/publisher sources. 177/181 refs were correct.

Co-Authored-By: Claude Opus 4.8 (1M context) <noreply@anthropic.com>
</commit_message>
<xml_diff>
--- a/07_bnpl_credit_file/paper/main.docx
+++ b/07_bnpl_credit_file/paper/main.docx
@@ -7373,13 +7373,7 @@
         <w:t xml:space="preserve"> </w:t>
       </w:r>
       <w:r>
-        <w:t xml:space="preserve">di Maggio, M., Williams, E., Katz, J., 2022. Buy</w:t>
-      </w:r>
-      <w:r>
-        <w:t xml:space="preserve"> </w:t>
-      </w:r>
-      <w:r>
-        <w:t xml:space="preserve">now, pay later and financial fragility. NBER Working Paper 30508.</w:t>
+        <w:t xml:space="preserve">di Maggio, M., Williams, E., Katz, J., 2022. Buy now, pay later credit: user characteristics and effects on spending patterns. NBER Working Paper 30508.</w:t>
       </w:r>
       <w:r>
         <w:t xml:space="preserve"> </w:t>

</xml_diff>